<commit_message>
Incorporar recepción por correo y extracción OCR/IA; alinear documentos con el ERS
ERS: RF01 multicanal, RF12 extraccion OCR/IA, RN05, CU02 y CU12. Diagramas, Gantt, EDT, RACI, Acta, README, Plan de Pruebas, Plan de Calidad, Matriz de Riesgos y mockups actualizados. SQL Server como motor de base de datos.
</commit_message>
<xml_diff>
--- a/Fase 2/Evidencias Proyecto/Evidencias de Documentación/Análisis y Diseño/Documento de Especificación de Requerimientos (ERS) - TTDH Automation.docx
+++ b/Fase 2/Evidencias Proyecto/Evidencias de Documentación/Análisis y Diseño/Documento de Especificación de Requerimientos (ERS) - TTDH Automation.docx
@@ -169,13 +169,13 @@
           <w:bCs w:val="1"/>
           <w:rtl w:val="0"/>
         </w:rPr>
-        <w:t xml:space="preserve">Ingesta y Extracción de Archivos TGR:</w:t>
+        <w:t>Recepción, Ingesta y Extracción de Documentos TGR:</w:t>
       </w:r>
       <w:r>
         <w:rPr>
           <w:rtl w:val="0"/>
         </w:rPr>
-        <w:t xml:space="preserve"> El sistema recibe e ingiere archivos de nóminas enviadas por la TGR (formatos estructurados/semiestructurados). Realiza un parsing automatizado para extraer los registros de depósitos, devoluciones y traspasos.</w:t>
+        <w:t xml:space="preserve"> El sistema recibe los documentos de nóminas enviados por la TGR a través de la casilla de correo institucional (descarga automática de los adjuntos), del directorio SFTP o de la carga manual vía web. Los documentos pueden llegar en formatos estructurados (Excel, CSV, TXT) o no estructurados (PDF, documentos escaneados y fotografías). Los formatos no estructurados se convierten a una plantilla estándar mediante un módulo de extracción con OCR e Inteligencia Artificial; luego todos se procesan con un parsing automatizado para extraer los registros de depósitos, devoluciones y traspasos.</w:t>
       </w:r>
     </w:p>
     <w:p>
@@ -475,7 +475,7 @@
               <w:rPr>
                 <w:rtl w:val="0"/>
               </w:rPr>
-              <w:t xml:space="preserve">Ingesta Multiformato de Archivos TGR</w:t>
+              <w:t>Recepción Multicanal y Multiformato de Documentos TGR</w:t>
             </w:r>
           </w:p>
         </w:tc>
@@ -489,7 +489,7 @@
               <w:rPr>
                 <w:rtl w:val="0"/>
               </w:rPr>
-              <w:t xml:space="preserve">El sistema debe permitir la carga masiva y automatizada de archivos TGR en diversos formatos (TXT, CSV, XLSX) mediante interfaz web y directorio seguro (SFTP).</w:t>
+              <w:t>El sistema debe recibir los documentos TGR por tres canales: (1) lectura automática de la casilla de correo institucional, descargando los adjuntos de remitentes autorizados; (2) directorio seguro SFTP; y (3) carga manual mediante interfaz web. Debe aceptar formatos estructurados (XLSX, XLS, CSV, TXT) y no estructurados (PDF con texto, PDF escaneado e imágenes JPG/PNG), conservando el documento original y los datos del correo (remitente, asunto y fecha) para su trazabilidad.</w:t>
             </w:r>
           </w:p>
         </w:tc>
@@ -1040,6 +1040,61 @@
                 <w:rtl w:val="0"/>
               </w:rPr>
               <w:t xml:space="preserve">El sistema debe permitir la exportación de los datasets procesados y reportes en formatos estándar (Excel, PDF, CSV).</w:t>
+            </w:r>
+          </w:p>
+        </w:tc>
+      </w:tr>
+      <w:tr>
+        <w:trPr>
+          <w:cantSplit w:val="0"/>
+          <w:tblHeader w:val="0"/>
+        </w:trPr>
+        <w:tc>
+          <w:tcPr/>
+          <w:p>
+            <w:pPr>
+              <w:rPr/>
+            </w:pPr>
+            <w:r>
+              <w:rPr>
+                <w:b/>
+                <w:bCs w:val="1"/>
+                <w:rtl w:val="0"/>
+              </w:rPr>
+              <w:t>RF12</w:t>
+            </w:r>
+            <w:r>
+              <w:rPr>
+                <w:rtl w:val="0"/>
+              </w:rPr>
+            </w:r>
+          </w:p>
+        </w:tc>
+        <w:tc>
+          <w:tcPr/>
+          <w:p>
+            <w:pPr>
+              <w:rPr/>
+            </w:pPr>
+            <w:r>
+              <w:rPr>
+                <w:rtl w:val="0"/>
+              </w:rPr>
+              <w:t>Extracción y Normalización de Documentos (OCR/IA)</w:t>
+            </w:r>
+          </w:p>
+        </w:tc>
+        <w:tc>
+          <w:tcPr/>
+          <w:p>
+            <w:pPr>
+              <w:rPr/>
+            </w:pPr>
+            <w:r>
+              <w:rPr>
+                <w:rtl w:val="0"/>
+              </w:rPr>
+              <w:t>El sistema debe convertir los documentos no estructurados a la plantilla estándar de carga (columnas predefinidas) antes del proceso ETL: extracción directa de tablas en los PDF con texto, y OCR con apoyo de un modelo de IA con visión para PDF escaneados y fotografías. Cada registro extraído debe incluir su nivel de confianza; los registros bajo el umbral definido (RN05) se derivan a revisión manual. Alcance del proyecto: Excel/CSV, PDF con texto y PDF escaneados o fotografías de nóminas en formato tabular.</w:t>
             </w:r>
           </w:p>
         </w:tc>
@@ -1407,6 +1462,29 @@
     </w:p>
     <w:p>
       <w:pPr>
+        <w:numPr>
+          <w:ilvl w:val="0"/>
+          <w:numId w:val="1"/>
+        </w:numPr>
+        <w:ind w:left="720" w:hanging="360"/>
+      </w:pPr>
+      <w:r>
+        <w:rPr>
+          <w:b w:val="1"/>
+          <w:bCs w:val="1"/>
+          <w:rtl w:val="0"/>
+        </w:rPr>
+        <w:t>RN05 - Umbral de Confianza en la Extracción:</w:t>
+      </w:r>
+      <w:r>
+        <w:rPr>
+          <w:rtl w:val="0"/>
+        </w:rPr>
+        <w:t xml:space="preserve"> Todo registro obtenido mediante OCR/IA desde un PDF escaneado o una imagen debe alcanzar un nivel de confianza mínimo de 90% en sus campos críticos (RUT, Monto y Cuenta de Destino) y cuadrar con las sumatorias de control del documento cuando existan. Los registros que no cumplan se derivan a la Bandeja de Excepciones como "Revisión de Extracción" y no ingresan al cruce automático hasta ser validados por un Analista.</w:t>
+      </w:r>
+    </w:p>
+    <w:p>
+      <w:pPr>
         <w:rPr/>
       </w:pPr>
       <w:r>
@@ -1773,7 +1851,7 @@
                 <w:b/>
                 <w:sz w:val="20"/>
               </w:rPr>
-              <w:t>TGR (SFTP)</w:t>
+              <w:t>TGR (Correo / SFTP)</w:t>
             </w:r>
           </w:p>
         </w:tc>
@@ -1809,7 +1887,7 @@
                 <w:b w:val="0"/>
                 <w:sz w:val="20"/>
               </w:rPr>
-              <w:t>Tesorería General de la República. Deposita periódicamente los archivos de deudores en el directorio SFTP.</w:t>
+              <w:t>Tesorería General de la República. Envía periódicamente los documentos de deudores a la casilla de correo institucional (Excel, PDF, escaneos o fotografías) o los deposita en el directorio SFTP.</w:t>
             </w:r>
           </w:p>
         </w:tc>
@@ -1928,6 +2006,65 @@
                 <w:sz w:val="20"/>
               </w:rPr>
               <w:t>Servicio institucional de autenticación de Banco Genérico.</w:t>
+            </w:r>
+          </w:p>
+        </w:tc>
+      </w:tr>
+      <w:tr>
+        <w:trPr>
+          <w:cantSplit w:val="1"/>
+        </w:trPr>
+        <w:tc>
+          <w:tcPr>
+            <w:tcW w:type="dxa" w:w="2304"/>
+          </w:tcPr>
+          <w:p>
+            <w:pPr>
+              <w:spacing w:after="20"/>
+            </w:pPr>
+            <w:r/>
+            <w:r>
+              <w:rPr>
+                <w:b/>
+                <w:sz w:val="20"/>
+              </w:rPr>
+              <w:t>Servicio de OCR / IA</w:t>
+            </w:r>
+          </w:p>
+        </w:tc>
+        <w:tc>
+          <w:tcPr>
+            <w:tcW w:type="dxa" w:w="2016"/>
+          </w:tcPr>
+          <w:p>
+            <w:pPr>
+              <w:spacing w:after="20"/>
+            </w:pPr>
+            <w:r/>
+            <w:r>
+              <w:rPr>
+                <w:b w:val="0"/>
+                <w:sz w:val="20"/>
+              </w:rPr>
+              <w:t>Secundario (sistema externo)</w:t>
+            </w:r>
+          </w:p>
+        </w:tc>
+        <w:tc>
+          <w:tcPr>
+            <w:tcW w:type="dxa" w:w="4680"/>
+          </w:tcPr>
+          <w:p>
+            <w:pPr>
+              <w:spacing w:after="20"/>
+            </w:pPr>
+            <w:r/>
+            <w:r>
+              <w:rPr>
+                <w:b w:val="0"/>
+                <w:sz w:val="20"/>
+              </w:rPr>
+              <w:t>Servicio de reconocimiento óptico de caracteres y modelo de IA con visión, utilizado para extraer los datos de PDF escaneados y fotografías.</w:t>
             </w:r>
           </w:p>
         </w:tc>
@@ -1945,7 +2082,7 @@
     </w:p>
     <w:p>
       <w:r>
-        <w:t>El diagrama muestra los once casos de uso del sistema. Los roles de usuario se organizan por herencia: el Analista y el Auditor heredan las funciones del Usuario de Consulta, y el Administrador hereda las del Analista. La carga de un archivo incluye su procesamiento ETL, que a su vez incluye el cruce con el Core Bancario.</w:t>
+        <w:t>El diagrama muestra los doce casos de uso del sistema. Los roles de usuario se organizan por herencia: el Analista y el Auditor heredan las funciones del Usuario de Consulta, y el Administrador hereda las del Analista. La recepción de un documento incluye su procesamiento ETL y, cuando se trata de un PDF o una imagen, se extiende con la extracción y normalización mediante OCR/IA (CU12). El procesamiento ETL que a su vez incluye el cruce con el Core Bancario.</w:t>
       </w:r>
     </w:p>
     <w:p>
@@ -1955,7 +2092,7 @@
       <w:r>
         <w:drawing>
           <wp:inline>
-            <wp:extent cx="5715000" cy="3665809"/>
+            <wp:extent cx="5715000" cy="4307671"/>
             <wp:docPr id="1" name="Picture 1"/>
             <wp:cNvGraphicFramePr>
               <a:graphicFrameLocks noChangeAspect="1"/>
@@ -1976,7 +2113,7 @@
                   <pic:spPr>
                     <a:xfrm>
                       <a:off x="0" y="0"/>
-                      <a:ext cx="5715000" cy="3665809"/>
+                      <a:ext cx="5715000" cy="4307671"/>
                     </a:xfrm>
                     <a:prstGeom prst="rect"/>
                   </pic:spPr>
@@ -2222,7 +2359,7 @@
                 <w:b w:val="0"/>
                 <w:sz w:val="20"/>
               </w:rPr>
-              <w:t>Cargar archivo TGR</w:t>
+              <w:t>Recibir y cargar documentos TGR</w:t>
             </w:r>
           </w:p>
         </w:tc>
@@ -2240,7 +2377,7 @@
                 <w:b w:val="0"/>
                 <w:sz w:val="20"/>
               </w:rPr>
-              <w:t>Analista de Conciliación; TGR (SFTP)</w:t>
+              <w:t>Analista de Conciliación; TGR (Correo / SFTP)</w:t>
             </w:r>
           </w:p>
         </w:tc>
@@ -2952,6 +3089,83 @@
                 <w:sz w:val="20"/>
               </w:rPr>
               <w:t>RF10; RNF Trazabilidad</w:t>
+            </w:r>
+          </w:p>
+        </w:tc>
+      </w:tr>
+      <w:tr>
+        <w:trPr>
+          <w:cantSplit w:val="1"/>
+        </w:trPr>
+        <w:tc>
+          <w:tcPr>
+            <w:tcW w:type="dxa" w:w="1008"/>
+          </w:tcPr>
+          <w:p>
+            <w:pPr>
+              <w:spacing w:after="20"/>
+            </w:pPr>
+            <w:r/>
+            <w:r>
+              <w:rPr>
+                <w:b/>
+                <w:sz w:val="20"/>
+              </w:rPr>
+              <w:t>CU12</w:t>
+            </w:r>
+          </w:p>
+        </w:tc>
+        <w:tc>
+          <w:tcPr>
+            <w:tcW w:type="dxa" w:w="2880"/>
+          </w:tcPr>
+          <w:p>
+            <w:pPr>
+              <w:spacing w:after="20"/>
+            </w:pPr>
+            <w:r/>
+            <w:r>
+              <w:rPr>
+                <w:b w:val="0"/>
+                <w:sz w:val="20"/>
+              </w:rPr>
+              <w:t>Extraer y normalizar documento (OCR/IA)</w:t>
+            </w:r>
+          </w:p>
+        </w:tc>
+        <w:tc>
+          <w:tcPr>
+            <w:tcW w:type="dxa" w:w="2880"/>
+          </w:tcPr>
+          <w:p>
+            <w:pPr>
+              <w:spacing w:after="20"/>
+            </w:pPr>
+            <w:r/>
+            <w:r>
+              <w:rPr>
+                <w:b w:val="0"/>
+                <w:sz w:val="20"/>
+              </w:rPr>
+              <w:t>Sistema (extiende CU02); Servicio de OCR / IA</w:t>
+            </w:r>
+          </w:p>
+        </w:tc>
+        <w:tc>
+          <w:tcPr>
+            <w:tcW w:type="dxa" w:w="2232"/>
+          </w:tcPr>
+          <w:p>
+            <w:pPr>
+              <w:spacing w:after="20"/>
+            </w:pPr>
+            <w:r/>
+            <w:r>
+              <w:rPr>
+                <w:b w:val="0"/>
+                <w:sz w:val="20"/>
+              </w:rPr>
+              <w:t>RF12; RN05</w:t>
             </w:r>
           </w:p>
         </w:tc>
@@ -3532,7 +3746,7 @@
                 <w:b w:val="0"/>
                 <w:sz w:val="20"/>
               </w:rPr>
-              <w:t>Cargar archivo TGR</w:t>
+              <w:t>Recibir y cargar documentos TGR</w:t>
             </w:r>
           </w:p>
         </w:tc>
@@ -3574,7 +3788,7 @@
                 <w:b w:val="0"/>
                 <w:sz w:val="20"/>
               </w:rPr>
-              <w:t>Analista de Conciliación; TGR (SFTP)</w:t>
+              <w:t>Analista de Conciliación; TGR (Correo / SFTP)</w:t>
             </w:r>
           </w:p>
         </w:tc>
@@ -3658,7 +3872,7 @@
                 <w:b w:val="0"/>
                 <w:sz w:val="20"/>
               </w:rPr>
-              <w:t>Permite incorporar a la plataforma un archivo de deudores enviado por la TGR, ya sea por carga web o por lectura automática del directorio SFTP.</w:t>
+              <w:t>Permite incorporar a la plataforma los documentos de deudores enviados por la TGR, recibidos automáticamente desde la casilla de correo institucional o el directorio SFTP, o cargados manualmente vía web. Admite Excel, CSV, TXT, PDF e imágenes.</w:t>
             </w:r>
           </w:p>
         </w:tc>
@@ -3700,7 +3914,7 @@
                 <w:b w:val="0"/>
                 <w:sz w:val="20"/>
               </w:rPr>
-              <w:t>Sesión iniciada con rol Analista o Administrador (carga web), o canal SFTP configurado (carga automática).</w:t>
+              <w:t>Casilla de correo institucional configurada (lectura automática), canal SFTP configurado, o sesión iniciada con rol Analista o Administrador (carga web).</w:t>
             </w:r>
           </w:p>
         </w:tc>
@@ -3742,55 +3956,55 @@
                 <w:b w:val="0"/>
                 <w:sz w:val="20"/>
               </w:rPr>
-              <w:t>1. El Analista ingresa al módulo de Ingesta de Archivos.</w:t>
-            </w:r>
-          </w:p>
-          <w:p>
-            <w:pPr>
-              <w:spacing w:after="20"/>
-            </w:pPr>
-            <w:r>
-              <w:rPr>
-                <w:b w:val="0"/>
-                <w:sz w:val="20"/>
-              </w:rPr>
-              <w:t>2. Selecciona el periodo tributario.</w:t>
-            </w:r>
-          </w:p>
-          <w:p>
-            <w:pPr>
-              <w:spacing w:after="20"/>
-            </w:pPr>
-            <w:r>
-              <w:rPr>
-                <w:b w:val="0"/>
-                <w:sz w:val="20"/>
-              </w:rPr>
-              <w:t>3. Arrastra o selecciona el archivo a cargar.</w:t>
-            </w:r>
-          </w:p>
-          <w:p>
-            <w:pPr>
-              <w:spacing w:after="20"/>
-            </w:pPr>
-            <w:r>
-              <w:rPr>
-                <w:b w:val="0"/>
-                <w:sz w:val="20"/>
-              </w:rPr>
-              <w:t>4. El sistema verifica que la extensión sea permitida (.csv, .xlsx, .txt).</w:t>
-            </w:r>
-          </w:p>
-          <w:p>
-            <w:pPr>
-              <w:spacing w:after="20"/>
-            </w:pPr>
-            <w:r>
-              <w:rPr>
-                <w:b w:val="0"/>
-                <w:sz w:val="20"/>
-              </w:rPr>
-              <w:t>5. El sistema registra el archivo en Archivos_TGR con estado "Recibido".</w:t>
+              <w:t>1. El sistema revisa la casilla de correo institucional según la programación definida.</w:t>
+            </w:r>
+          </w:p>
+          <w:p>
+            <w:pPr>
+              <w:spacing w:after="20"/>
+            </w:pPr>
+            <w:r>
+              <w:rPr>
+                <w:b w:val="0"/>
+                <w:sz w:val="20"/>
+              </w:rPr>
+              <w:t>2. Por cada correo nuevo de un remitente autorizado, descarga sus adjuntos.</w:t>
+            </w:r>
+          </w:p>
+          <w:p>
+            <w:pPr>
+              <w:spacing w:after="20"/>
+            </w:pPr>
+            <w:r>
+              <w:rPr>
+                <w:b w:val="0"/>
+                <w:sz w:val="20"/>
+              </w:rPr>
+              <w:t>3. El sistema verifica que el tipo de archivo sea permitido (.xlsx, .xls, .csv, .txt, .pdf, .jpg, .png).</w:t>
+            </w:r>
+          </w:p>
+          <w:p>
+            <w:pPr>
+              <w:spacing w:after="20"/>
+            </w:pPr>
+            <w:r>
+              <w:rPr>
+                <w:b w:val="0"/>
+                <w:sz w:val="20"/>
+              </w:rPr>
+              <w:t>4. El sistema guarda el documento original y lo registra en Archivos_TGR con estado "Recibido", junto al canal, remitente y fecha del correo.</w:t>
+            </w:r>
+          </w:p>
+          <w:p>
+            <w:pPr>
+              <w:spacing w:after="20"/>
+            </w:pPr>
+            <w:r>
+              <w:rPr>
+                <w:b w:val="0"/>
+                <w:sz w:val="20"/>
+              </w:rPr>
+              <w:t>5. Si el documento es PDF o imagen, se ejecuta CU12 Extraer y normalizar documento (&lt;&lt;extend&gt;&gt;).</w:t>
             </w:r>
           </w:p>
           <w:p>
@@ -3814,7 +4028,7 @@
                 <w:b w:val="0"/>
                 <w:sz w:val="20"/>
               </w:rPr>
-              <w:t>7. El sistema muestra el lote en la tabla de lotes recientes con su estado.</w:t>
+              <w:t>7. El sistema marca el correo como procesado y muestra el lote en la tabla de lotes recientes con su estado.</w:t>
             </w:r>
           </w:p>
         </w:tc>
@@ -3856,31 +4070,67 @@
                 <w:b w:val="0"/>
                 <w:sz w:val="20"/>
               </w:rPr>
-              <w:t>3a. Carga automática: el sistema lee el directorio SFTP según la programación definida y continúa en el paso 4.</w:t>
-            </w:r>
-          </w:p>
-          <w:p>
-            <w:pPr>
-              <w:spacing w:after="20"/>
-            </w:pPr>
-            <w:r>
-              <w:rPr>
-                <w:b w:val="0"/>
-                <w:sz w:val="20"/>
-              </w:rPr>
-              <w:t>4a. Extensión no permitida: el sistema informa el error y no registra el archivo.</w:t>
-            </w:r>
-          </w:p>
-          <w:p>
-            <w:pPr>
-              <w:spacing w:after="20"/>
-            </w:pPr>
-            <w:r>
-              <w:rPr>
-                <w:b w:val="0"/>
-                <w:sz w:val="20"/>
-              </w:rPr>
-              <w:t>5a. Archivo previamente procesado: el sistema advierte la duplicidad (RN02) y rechaza la carga.</w:t>
+              <w:t>1a. Carga web: el Analista ingresa al módulo de Ingesta, selecciona el periodo tributario y arrastra o selecciona el archivo; continúa en el paso 3.</w:t>
+            </w:r>
+          </w:p>
+          <w:p>
+            <w:pPr>
+              <w:spacing w:after="20"/>
+            </w:pPr>
+            <w:r>
+              <w:rPr>
+                <w:b w:val="0"/>
+                <w:sz w:val="20"/>
+              </w:rPr>
+              <w:t>1b. Carga SFTP: el sistema lee el directorio SFTP según la programación definida y continúa en el paso 3.</w:t>
+            </w:r>
+          </w:p>
+          <w:p>
+            <w:pPr>
+              <w:spacing w:after="20"/>
+            </w:pPr>
+            <w:r>
+              <w:rPr>
+                <w:b w:val="0"/>
+                <w:sz w:val="20"/>
+              </w:rPr>
+              <w:t>2a. Remitente no autorizado: el correo se ignora y queda registrado en la bitácora.</w:t>
+            </w:r>
+          </w:p>
+          <w:p>
+            <w:pPr>
+              <w:spacing w:after="20"/>
+            </w:pPr>
+            <w:r>
+              <w:rPr>
+                <w:b w:val="0"/>
+                <w:sz w:val="20"/>
+              </w:rPr>
+              <w:t>2b. Correo sin adjuntos: se registra en la bitácora y se notifica al Analista.</w:t>
+            </w:r>
+          </w:p>
+          <w:p>
+            <w:pPr>
+              <w:spacing w:after="20"/>
+            </w:pPr>
+            <w:r>
+              <w:rPr>
+                <w:b w:val="0"/>
+                <w:sz w:val="20"/>
+              </w:rPr>
+              <w:t>3a. Tipo de archivo no permitido: el sistema informa el error y no registra el documento.</w:t>
+            </w:r>
+          </w:p>
+          <w:p>
+            <w:pPr>
+              <w:spacing w:after="20"/>
+            </w:pPr>
+            <w:r>
+              <w:rPr>
+                <w:b w:val="0"/>
+                <w:sz w:val="20"/>
+              </w:rPr>
+              <w:t>4a. Documento previamente procesado: el sistema advierte la duplicidad (RN02) y rechaza la carga.</w:t>
             </w:r>
           </w:p>
         </w:tc>
@@ -3922,7 +4172,7 @@
                 <w:b w:val="0"/>
                 <w:sz w:val="20"/>
               </w:rPr>
-              <w:t>El archivo queda registrado y en procesamiento.</w:t>
+              <w:t>Cada documento queda registrado junto a su original y en procesamiento.</w:t>
             </w:r>
           </w:p>
         </w:tc>
@@ -4193,7 +4443,7 @@
                 <w:b w:val="0"/>
                 <w:sz w:val="20"/>
               </w:rPr>
-              <w:t>Existe un archivo registrado con estado "Recibido".</w:t>
+              <w:t>Existe un archivo registrado con estado "Recibido" (formato estructurado) o "Normalizado" (convertido mediante CU12).</w:t>
             </w:r>
           </w:p>
         </w:tc>
@@ -8204,6 +8454,514 @@
                 <w:sz w:val="20"/>
               </w:rPr>
               <w:t>Ninguna. La bitácora no puede ser modificada por ningún rol.</w:t>
+            </w:r>
+          </w:p>
+        </w:tc>
+      </w:tr>
+    </w:tbl>
+    <w:p/>
+    <w:tbl>
+      <w:tblPr>
+        <w:tblW w:type="auto" w:w="0"/>
+        <w:tblLook w:firstColumn="1" w:firstRow="1" w:lastColumn="0" w:lastRow="0" w:noHBand="0" w:noVBand="1" w:val="04A0"/>
+        <w:tblBorders>
+          <w:top w:val="single" w:sz="4" w:space="0" w:color="CBD5E1"/>
+          <w:left w:val="single" w:sz="4" w:space="0" w:color="CBD5E1"/>
+          <w:bottom w:val="single" w:sz="4" w:space="0" w:color="CBD5E1"/>
+          <w:right w:val="single" w:sz="4" w:space="0" w:color="CBD5E1"/>
+          <w:insideH w:val="single" w:sz="4" w:space="0" w:color="CBD5E1"/>
+          <w:insideV w:val="single" w:sz="4" w:space="0" w:color="CBD5E1"/>
+        </w:tblBorders>
+      </w:tblPr>
+      <w:tblGrid>
+        <w:gridCol w:w="4514"/>
+        <w:gridCol w:w="4514"/>
+      </w:tblGrid>
+      <w:tr>
+        <w:trPr>
+          <w:cantSplit w:val="1"/>
+        </w:trPr>
+        <w:tc>
+          <w:tcPr>
+            <w:tcW w:type="dxa" w:w="2160"/>
+            <w:shd w:val="clear" w:color="auto" w:fill="DCE8F5"/>
+          </w:tcPr>
+          <w:p>
+            <w:pPr>
+              <w:spacing w:after="20"/>
+            </w:pPr>
+            <w:r/>
+            <w:r>
+              <w:rPr>
+                <w:b/>
+                <w:sz w:val="20"/>
+              </w:rPr>
+              <w:t>Código</w:t>
+            </w:r>
+          </w:p>
+        </w:tc>
+        <w:tc>
+          <w:tcPr>
+            <w:tcW w:type="dxa" w:w="6840"/>
+          </w:tcPr>
+          <w:p>
+            <w:pPr>
+              <w:spacing w:after="20"/>
+            </w:pPr>
+            <w:r/>
+            <w:r>
+              <w:rPr>
+                <w:b w:val="0"/>
+                <w:sz w:val="20"/>
+              </w:rPr>
+              <w:t>CU12</w:t>
+            </w:r>
+          </w:p>
+        </w:tc>
+      </w:tr>
+      <w:tr>
+        <w:trPr>
+          <w:cantSplit w:val="1"/>
+        </w:trPr>
+        <w:tc>
+          <w:tcPr>
+            <w:tcW w:type="dxa" w:w="2160"/>
+            <w:shd w:val="clear" w:color="auto" w:fill="DCE8F5"/>
+          </w:tcPr>
+          <w:p>
+            <w:pPr>
+              <w:spacing w:after="20"/>
+            </w:pPr>
+            <w:r/>
+            <w:r>
+              <w:rPr>
+                <w:b/>
+                <w:sz w:val="20"/>
+              </w:rPr>
+              <w:t>Nombre</w:t>
+            </w:r>
+          </w:p>
+        </w:tc>
+        <w:tc>
+          <w:tcPr>
+            <w:tcW w:type="dxa" w:w="6840"/>
+          </w:tcPr>
+          <w:p>
+            <w:pPr>
+              <w:spacing w:after="20"/>
+            </w:pPr>
+            <w:r/>
+            <w:r>
+              <w:rPr>
+                <w:b w:val="0"/>
+                <w:sz w:val="20"/>
+              </w:rPr>
+              <w:t>Extraer y normalizar documento (OCR/IA)</w:t>
+            </w:r>
+          </w:p>
+        </w:tc>
+      </w:tr>
+      <w:tr>
+        <w:trPr>
+          <w:cantSplit w:val="1"/>
+        </w:trPr>
+        <w:tc>
+          <w:tcPr>
+            <w:tcW w:type="dxa" w:w="2160"/>
+            <w:shd w:val="clear" w:color="auto" w:fill="DCE8F5"/>
+          </w:tcPr>
+          <w:p>
+            <w:pPr>
+              <w:spacing w:after="20"/>
+            </w:pPr>
+            <w:r/>
+            <w:r>
+              <w:rPr>
+                <w:b/>
+                <w:sz w:val="20"/>
+              </w:rPr>
+              <w:t>Actores</w:t>
+            </w:r>
+          </w:p>
+        </w:tc>
+        <w:tc>
+          <w:tcPr>
+            <w:tcW w:type="dxa" w:w="6840"/>
+          </w:tcPr>
+          <w:p>
+            <w:pPr>
+              <w:spacing w:after="20"/>
+            </w:pPr>
+            <w:r/>
+            <w:r>
+              <w:rPr>
+                <w:b w:val="0"/>
+                <w:sz w:val="20"/>
+              </w:rPr>
+              <w:t>Sistema (extiende CU02); Servicio de OCR / IA</w:t>
+            </w:r>
+          </w:p>
+        </w:tc>
+      </w:tr>
+      <w:tr>
+        <w:trPr>
+          <w:cantSplit w:val="1"/>
+        </w:trPr>
+        <w:tc>
+          <w:tcPr>
+            <w:tcW w:type="dxa" w:w="2160"/>
+            <w:shd w:val="clear" w:color="auto" w:fill="DCE8F5"/>
+          </w:tcPr>
+          <w:p>
+            <w:pPr>
+              <w:spacing w:after="20"/>
+            </w:pPr>
+            <w:r/>
+            <w:r>
+              <w:rPr>
+                <w:b/>
+                <w:sz w:val="20"/>
+              </w:rPr>
+              <w:t>Requerimientos</w:t>
+            </w:r>
+          </w:p>
+        </w:tc>
+        <w:tc>
+          <w:tcPr>
+            <w:tcW w:type="dxa" w:w="6840"/>
+          </w:tcPr>
+          <w:p>
+            <w:pPr>
+              <w:spacing w:after="20"/>
+            </w:pPr>
+            <w:r/>
+            <w:r>
+              <w:rPr>
+                <w:b w:val="0"/>
+                <w:sz w:val="20"/>
+              </w:rPr>
+              <w:t>RF12; RN05</w:t>
+            </w:r>
+          </w:p>
+        </w:tc>
+      </w:tr>
+      <w:tr>
+        <w:trPr>
+          <w:cantSplit w:val="1"/>
+        </w:trPr>
+        <w:tc>
+          <w:tcPr>
+            <w:tcW w:type="dxa" w:w="2160"/>
+            <w:shd w:val="clear" w:color="auto" w:fill="DCE8F5"/>
+          </w:tcPr>
+          <w:p>
+            <w:pPr>
+              <w:spacing w:after="20"/>
+            </w:pPr>
+            <w:r/>
+            <w:r>
+              <w:rPr>
+                <w:b/>
+                <w:sz w:val="20"/>
+              </w:rPr>
+              <w:t>Descripción</w:t>
+            </w:r>
+          </w:p>
+        </w:tc>
+        <w:tc>
+          <w:tcPr>
+            <w:tcW w:type="dxa" w:w="6840"/>
+          </w:tcPr>
+          <w:p>
+            <w:pPr>
+              <w:spacing w:after="20"/>
+            </w:pPr>
+            <w:r/>
+            <w:r>
+              <w:rPr>
+                <w:b w:val="0"/>
+                <w:sz w:val="20"/>
+              </w:rPr>
+              <w:t>Convierte un documento no estructurado (PDF o imagen) recibido mediante CU02 en un archivo con la plantilla estándar de carga, para que pueda ser procesado por el ETL (CU03).</w:t>
+            </w:r>
+          </w:p>
+        </w:tc>
+      </w:tr>
+      <w:tr>
+        <w:trPr>
+          <w:cantSplit w:val="1"/>
+        </w:trPr>
+        <w:tc>
+          <w:tcPr>
+            <w:tcW w:type="dxa" w:w="2160"/>
+            <w:shd w:val="clear" w:color="auto" w:fill="DCE8F5"/>
+          </w:tcPr>
+          <w:p>
+            <w:pPr>
+              <w:spacing w:after="20"/>
+            </w:pPr>
+            <w:r/>
+            <w:r>
+              <w:rPr>
+                <w:b/>
+                <w:sz w:val="20"/>
+              </w:rPr>
+              <w:t>Precondiciones</w:t>
+            </w:r>
+          </w:p>
+        </w:tc>
+        <w:tc>
+          <w:tcPr>
+            <w:tcW w:type="dxa" w:w="6840"/>
+          </w:tcPr>
+          <w:p>
+            <w:pPr>
+              <w:spacing w:after="20"/>
+            </w:pPr>
+            <w:r/>
+            <w:r>
+              <w:rPr>
+                <w:b w:val="0"/>
+                <w:sz w:val="20"/>
+              </w:rPr>
+              <w:t>Existe un documento registrado con estado "Recibido" de tipo PDF o imagen.</w:t>
+            </w:r>
+          </w:p>
+        </w:tc>
+      </w:tr>
+      <w:tr>
+        <w:trPr>
+          <w:cantSplit w:val="1"/>
+        </w:trPr>
+        <w:tc>
+          <w:tcPr>
+            <w:tcW w:type="dxa" w:w="2160"/>
+            <w:shd w:val="clear" w:color="auto" w:fill="DCE8F5"/>
+          </w:tcPr>
+          <w:p>
+            <w:pPr>
+              <w:spacing w:after="20"/>
+            </w:pPr>
+            <w:r/>
+            <w:r>
+              <w:rPr>
+                <w:b/>
+                <w:sz w:val="20"/>
+              </w:rPr>
+              <w:t>Flujo principal</w:t>
+            </w:r>
+          </w:p>
+        </w:tc>
+        <w:tc>
+          <w:tcPr>
+            <w:tcW w:type="dxa" w:w="6840"/>
+          </w:tcPr>
+          <w:p>
+            <w:pPr>
+              <w:spacing w:after="20"/>
+            </w:pPr>
+            <w:r/>
+            <w:r>
+              <w:rPr>
+                <w:b w:val="0"/>
+                <w:sz w:val="20"/>
+              </w:rPr>
+              <w:t>1. El sistema identifica si el PDF contiene texto seleccionable o si es una imagen (escaneo o fotografía).</w:t>
+            </w:r>
+          </w:p>
+          <w:p>
+            <w:pPr>
+              <w:spacing w:after="20"/>
+            </w:pPr>
+            <w:r>
+              <w:rPr>
+                <w:b w:val="0"/>
+                <w:sz w:val="20"/>
+              </w:rPr>
+              <w:t>2. Si contiene texto, extrae directamente las tablas del documento.</w:t>
+            </w:r>
+          </w:p>
+          <w:p>
+            <w:pPr>
+              <w:spacing w:after="20"/>
+            </w:pPr>
+            <w:r>
+              <w:rPr>
+                <w:b w:val="0"/>
+                <w:sz w:val="20"/>
+              </w:rPr>
+              <w:t>3. Si es una imagen, la preprocesa (orientación, contraste y recorte) y la envía al Servicio de OCR / IA.</w:t>
+            </w:r>
+          </w:p>
+          <w:p>
+            <w:pPr>
+              <w:spacing w:after="20"/>
+            </w:pPr>
+            <w:r>
+              <w:rPr>
+                <w:b w:val="0"/>
+                <w:sz w:val="20"/>
+              </w:rPr>
+              <w:t>4. El Servicio de OCR / IA devuelve los campos de cada registro (RUT, nombre, monto, cuenta de destino, código de banco, tipo de movimiento y fecha) con su nivel de confianza.</w:t>
+            </w:r>
+          </w:p>
+          <w:p>
+            <w:pPr>
+              <w:spacing w:after="20"/>
+            </w:pPr>
+            <w:r>
+              <w:rPr>
+                <w:b w:val="0"/>
+                <w:sz w:val="20"/>
+              </w:rPr>
+              <w:t>5. El sistema mapea los campos a la plantilla estándar y compara los totales con las sumatorias de control del documento (RN05).</w:t>
+            </w:r>
+          </w:p>
+          <w:p>
+            <w:pPr>
+              <w:spacing w:after="20"/>
+            </w:pPr>
+            <w:r>
+              <w:rPr>
+                <w:b w:val="0"/>
+                <w:sz w:val="20"/>
+              </w:rPr>
+              <w:t>6. Genera el archivo normalizado, lo asocia al documento original y actualiza su estado a "Normalizado".</w:t>
+            </w:r>
+          </w:p>
+          <w:p>
+            <w:pPr>
+              <w:spacing w:after="20"/>
+            </w:pPr>
+            <w:r>
+              <w:rPr>
+                <w:b w:val="0"/>
+                <w:sz w:val="20"/>
+              </w:rPr>
+              <w:t>7. Continúa en CU03 Procesar y validar archivo.</w:t>
+            </w:r>
+          </w:p>
+        </w:tc>
+      </w:tr>
+      <w:tr>
+        <w:trPr>
+          <w:cantSplit w:val="1"/>
+        </w:trPr>
+        <w:tc>
+          <w:tcPr>
+            <w:tcW w:type="dxa" w:w="2160"/>
+            <w:shd w:val="clear" w:color="auto" w:fill="DCE8F5"/>
+          </w:tcPr>
+          <w:p>
+            <w:pPr>
+              <w:spacing w:after="20"/>
+            </w:pPr>
+            <w:r/>
+            <w:r>
+              <w:rPr>
+                <w:b/>
+                <w:sz w:val="20"/>
+              </w:rPr>
+              <w:t>Flujos alternativos</w:t>
+            </w:r>
+          </w:p>
+        </w:tc>
+        <w:tc>
+          <w:tcPr>
+            <w:tcW w:type="dxa" w:w="6840"/>
+          </w:tcPr>
+          <w:p>
+            <w:pPr>
+              <w:spacing w:after="20"/>
+            </w:pPr>
+            <w:r/>
+            <w:r>
+              <w:rPr>
+                <w:b w:val="0"/>
+                <w:sz w:val="20"/>
+              </w:rPr>
+              <w:t>2a. El documento no contiene una tabla reconocible: se marca con estado "Error de Extracción" y se notifica al Analista.</w:t>
+            </w:r>
+          </w:p>
+          <w:p>
+            <w:pPr>
+              <w:spacing w:after="20"/>
+            </w:pPr>
+            <w:r/>
+            <w:r>
+              <w:rPr>
+                <w:b w:val="0"/>
+                <w:sz w:val="20"/>
+              </w:rPr>
+              <w:t>3a. Servicio de OCR / IA no disponible: el sistema reintenta; si la falla persiste, el documento queda "Pendiente de Extracción".</w:t>
+            </w:r>
+          </w:p>
+          <w:p>
+            <w:pPr>
+              <w:spacing w:after="20"/>
+            </w:pPr>
+            <w:r/>
+            <w:r>
+              <w:rPr>
+                <w:b w:val="0"/>
+                <w:sz w:val="20"/>
+              </w:rPr>
+              <w:t>5a. Registros con confianza bajo el umbral (RN05): se derivan a la Bandeja de Excepciones como "Revisión de Extracción".</w:t>
+            </w:r>
+          </w:p>
+          <w:p>
+            <w:pPr>
+              <w:spacing w:after="20"/>
+            </w:pPr>
+            <w:r/>
+            <w:r>
+              <w:rPr>
+                <w:b w:val="0"/>
+                <w:sz w:val="20"/>
+              </w:rPr>
+              <w:t>5b. Los totales no cuadran con las sumatorias de control: el documento completo se deriva a revisión manual.</w:t>
+            </w:r>
+          </w:p>
+        </w:tc>
+      </w:tr>
+      <w:tr>
+        <w:trPr>
+          <w:cantSplit w:val="1"/>
+        </w:trPr>
+        <w:tc>
+          <w:tcPr>
+            <w:tcW w:type="dxa" w:w="2160"/>
+            <w:shd w:val="clear" w:color="auto" w:fill="DCE8F5"/>
+          </w:tcPr>
+          <w:p>
+            <w:pPr>
+              <w:spacing w:after="20"/>
+            </w:pPr>
+            <w:r/>
+            <w:r>
+              <w:rPr>
+                <w:b/>
+                <w:sz w:val="20"/>
+              </w:rPr>
+              <w:t>Postcondiciones</w:t>
+            </w:r>
+          </w:p>
+        </w:tc>
+        <w:tc>
+          <w:tcPr>
+            <w:tcW w:type="dxa" w:w="6840"/>
+          </w:tcPr>
+          <w:p>
+            <w:pPr>
+              <w:spacing w:after="20"/>
+            </w:pPr>
+            <w:r/>
+            <w:r>
+              <w:rPr>
+                <w:b w:val="0"/>
+                <w:sz w:val="20"/>
+              </w:rPr>
+              <w:t>El documento queda convertido a la plantilla estándar, con trazabilidad entre cada registro y su documento original.</w:t>
             </w:r>
           </w:p>
         </w:tc>

</xml_diff>

<commit_message>
Alinear documentación con Guía 2.4: stack definido, Tesseract OCR local y nueva actividad de entorno
</commit_message>
<xml_diff>
--- a/Fase 2/Evidencias Proyecto/Evidencias de Documentación/Análisis y Diseño/Documento de Especificación de Requerimientos (ERS) - TTDH Automation.docx
+++ b/Fase 2/Evidencias Proyecto/Evidencias de Documentación/Análisis y Diseño/Documento de Especificación de Requerimientos (ERS) - TTDH Automation.docx
@@ -1094,7 +1094,7 @@
               <w:rPr>
                 <w:rtl w:val="0"/>
               </w:rPr>
-              <w:t>El sistema debe convertir los documentos no estructurados a la plantilla estándar de carga (columnas predefinidas) antes del proceso ETL: extracción directa de tablas en los PDF con texto, y OCR con apoyo de un modelo de IA con visión para PDF escaneados y fotografías. Cada registro extraído debe incluir su nivel de confianza; los registros bajo el umbral definido (RN05) se derivan a revisión manual. Alcance del proyecto: Excel/CSV, PDF con texto y PDF escaneados o fotografías de nóminas en formato tabular.</w:t>
+              <w:t xml:space="preserve">El sistema debe convertir los documentos no estructurados a la plantilla estándar de carga (columnas predefinidas) antes del proceso ETL: extracción directa de tablas en los PDF con texto, y OCR local con Tesseract, previo preprocesamiento de la imagen, para PDF escaneados y fotografías. Cada registro extraído debe incluir su nivel de confianza; los registros bajo el umbral definido (RN05) se derivan a revisión manual. Alcance del proyecto: Excel/CSV, PDF con texto y PDF escaneados o fotografías de nóminas en formato tabular.</w:t>
             </w:r>
           </w:p>
         </w:tc>
@@ -2028,7 +2028,7 @@
                 <w:b/>
                 <w:sz w:val="20"/>
               </w:rPr>
-              <w:t>Servicio de OCR / IA</w:t>
+              <w:t xml:space="preserve">Motor OCR (Tesseract)</w:t>
             </w:r>
           </w:p>
         </w:tc>
@@ -2064,7 +2064,7 @@
                 <w:b w:val="0"/>
                 <w:sz w:val="20"/>
               </w:rPr>
-              <w:t>Servicio de reconocimiento óptico de caracteres y modelo de IA con visión, utilizado para extraer los datos de PDF escaneados y fotografías.</w:t>
+              <w:t xml:space="preserve">Motor de reconocimiento óptico de caracteres de código abierto, ejecutado localmente en el Servidor de Procesamiento, utilizado para extraer los datos de PDF escaneados y fotografías sin enviar documentos a servicios externos.</w:t>
             </w:r>
           </w:p>
         </w:tc>
@@ -2092,7 +2092,7 @@
       <w:r>
         <w:drawing>
           <wp:inline>
-            <wp:extent cx="5715000" cy="4307671"/>
+            <wp:extent cx="5715000" cy="3946475"/>
             <wp:docPr id="1" name="Picture 1"/>
             <wp:cNvGraphicFramePr>
               <a:graphicFrameLocks noChangeAspect="1"/>
@@ -2113,7 +2113,7 @@
                   <pic:spPr>
                     <a:xfrm>
                       <a:off x="0" y="0"/>
-                      <a:ext cx="5715000" cy="4307671"/>
+                      <a:ext cx="5715000" cy="3946475"/>
                     </a:xfrm>
                     <a:prstGeom prst="rect"/>
                   </pic:spPr>
@@ -3147,7 +3147,7 @@
                 <w:b w:val="0"/>
                 <w:sz w:val="20"/>
               </w:rPr>
-              <w:t>Sistema (extiende CU02); Servicio de OCR / IA</w:t>
+              <w:t xml:space="preserve">Sistema (extiende CU02); Motor OCR (Tesseract)</w:t>
             </w:r>
           </w:p>
         </w:tc>
@@ -8598,7 +8598,7 @@
                 <w:b w:val="0"/>
                 <w:sz w:val="20"/>
               </w:rPr>
-              <w:t>Sistema (extiende CU02); Servicio de OCR / IA</w:t>
+              <w:t xml:space="preserve">Sistema (extiende CU02); Motor OCR (Tesseract)</w:t>
             </w:r>
           </w:p>
         </w:tc>
@@ -8790,19 +8790,19 @@
                 <w:b w:val="0"/>
                 <w:sz w:val="20"/>
               </w:rPr>
-              <w:t>3. Si es una imagen, la preprocesa (orientación, contraste y recorte) y la envía al Servicio de OCR / IA.</w:t>
-            </w:r>
-          </w:p>
-          <w:p>
-            <w:pPr>
-              <w:spacing w:after="20"/>
-            </w:pPr>
-            <w:r>
-              <w:rPr>
-                <w:b w:val="0"/>
-                <w:sz w:val="20"/>
-              </w:rPr>
-              <w:t>4. El Servicio de OCR / IA devuelve los campos de cada registro (RUT, nombre, monto, cuenta de destino, código de banco, tipo de movimiento y fecha) con su nivel de confianza.</w:t>
+              <w:t xml:space="preserve">3. Si es una imagen, la preprocesa (orientación, contraste y recorte) y la procesa con el Motor OCR (Tesseract).</w:t>
+            </w:r>
+          </w:p>
+          <w:p>
+            <w:pPr>
+              <w:spacing w:after="20"/>
+            </w:pPr>
+            <w:r>
+              <w:rPr>
+                <w:b w:val="0"/>
+                <w:sz w:val="20"/>
+              </w:rPr>
+              <w:t xml:space="preserve">4. El Motor OCR (Tesseract) devuelve el texto reconocido con su nivel de confianza, y el sistema identifica los campos de cada registro (RUT, nombre, monto, cuenta de destino, código de banco, tipo de movimiento y fecha).</w:t>
             </w:r>
           </w:p>
           <w:p>
@@ -8893,7 +8893,7 @@
                 <w:b w:val="0"/>
                 <w:sz w:val="20"/>
               </w:rPr>
-              <w:t>3a. Servicio de OCR / IA no disponible: el sistema reintenta; si la falla persiste, el documento queda "Pendiente de Extracción".</w:t>
+              <w:t xml:space="preserve">3a. Falla del Motor OCR (Tesseract): el sistema reintenta; si la falla persiste, el documento queda "Pendiente de Extracción".</w:t>
             </w:r>
           </w:p>
           <w:p>

</xml_diff>